<commit_message>
docs: backlog v2.1 com as entregas de 28/09 e apresentação do 2º entregável
</commit_message>
<xml_diff>
--- a/docs/mvp2/MVP-II - Producao VF - Backlog e Planejamento.docx
+++ b/docs/mvp2/MVP-II - Producao VF - Backlog e Planejamento.docx
@@ -147,7 +147,7 @@
           <w:sz w:val="20"/>
           <w:szCs w:val="20"/>
         </w:rPr>
-        <w:t xml:space="preserve">Versão 2 · atualizada para a entrega do backlog</w:t>
+        <w:t xml:space="preserve">Versão 2.1 · atualizada na apresentação do sistema</w:t>
       </w:r>
     </w:p>
     <w:p>
@@ -161,7 +161,7 @@
           <w:sz w:val="22"/>
           <w:szCs w:val="22"/>
         </w:rPr>
-        <w:t xml:space="preserve">Novo Hamburgo, 24 de setembro de 2026</w:t>
+        <w:t xml:space="preserve">Novo Hamburgo, 28 de setembro de 2026</w:t>
       </w:r>
     </w:p>
     <w:p>
@@ -581,7 +581,7 @@
         </w:rPr>
         <w:t xml:space="preserve">4. Planejamento dos entregáveis</w:t>
         <w:tab/>
-        <w:t xml:space="preserve">41</w:t>
+        <w:t xml:space="preserve">42</w:t>
       </w:r>
     </w:p>
     <w:p>
@@ -602,7 +602,7 @@
         </w:rPr>
         <w:t xml:space="preserve">4.1 Premissas do planejamento</w:t>
         <w:tab/>
-        <w:t xml:space="preserve">41</w:t>
+        <w:t xml:space="preserve">42</w:t>
       </w:r>
     </w:p>
     <w:p>
@@ -623,7 +623,7 @@
         </w:rPr>
         <w:t xml:space="preserve">4.2 Definition of Ready e Definition of Done</w:t>
         <w:tab/>
-        <w:t xml:space="preserve">41</w:t>
+        <w:t xml:space="preserve">42</w:t>
       </w:r>
     </w:p>
     <w:p>
@@ -644,7 +644,7 @@
         </w:rPr>
         <w:t xml:space="preserve">4.3 Entregáveis por sprint</w:t>
         <w:tab/>
-        <w:t xml:space="preserve">41</w:t>
+        <w:t xml:space="preserve">42</w:t>
       </w:r>
     </w:p>
     <w:p>
@@ -665,7 +665,7 @@
         </w:rPr>
         <w:t xml:space="preserve">4.4 Marcos</w:t>
         <w:tab/>
-        <w:t xml:space="preserve">42</w:t>
+        <w:t xml:space="preserve">43</w:t>
       </w:r>
     </w:p>
     <w:p>
@@ -686,7 +686,7 @@
         </w:rPr>
         <w:t xml:space="preserve">4.5 Estrutura analítica e esforço</w:t>
         <w:tab/>
-        <w:t xml:space="preserve">43</w:t>
+        <w:t xml:space="preserve">44</w:t>
       </w:r>
     </w:p>
     <w:p>
@@ -707,7 +707,7 @@
         </w:rPr>
         <w:t xml:space="preserve">4.6 Matriz de riscos</w:t>
         <w:tab/>
-        <w:t xml:space="preserve">44</w:t>
+        <w:t xml:space="preserve">45</w:t>
       </w:r>
     </w:p>
     <w:p>
@@ -728,7 +728,7 @@
         </w:rPr>
         <w:t xml:space="preserve">4.7 O que saiu do MVP II, e por quê</w:t>
         <w:tab/>
-        <w:t xml:space="preserve">47</w:t>
+        <w:t xml:space="preserve">48</w:t>
       </w:r>
     </w:p>
     <w:p>
@@ -749,7 +749,7 @@
         </w:rPr>
         <w:t xml:space="preserve">5. Premissas assumidas e perguntas em aberto</w:t>
         <w:tab/>
-        <w:t xml:space="preserve">48</w:t>
+        <w:t xml:space="preserve">49</w:t>
       </w:r>
     </w:p>
     <w:p>
@@ -770,7 +770,7 @@
         </w:rPr>
         <w:t xml:space="preserve">5.1 Premissas assumidas</w:t>
         <w:tab/>
-        <w:t xml:space="preserve">48</w:t>
+        <w:t xml:space="preserve">49</w:t>
       </w:r>
     </w:p>
     <w:p>
@@ -791,7 +791,7 @@
         </w:rPr>
         <w:t xml:space="preserve">5.2 Perguntas em aberto</w:t>
         <w:tab/>
-        <w:t xml:space="preserve">48</w:t>
+        <w:t xml:space="preserve">49</w:t>
       </w:r>
     </w:p>
     <w:p>
@@ -812,7 +812,7 @@
         </w:rPr>
         <w:t xml:space="preserve">5.3 Evidências</w:t>
         <w:tab/>
-        <w:t xml:space="preserve">48</w:t>
+        <w:t xml:space="preserve">49</w:t>
       </w:r>
     </w:p>
     <w:p>
@@ -4106,7 +4106,7 @@
                 <w:sz w:val="19"/>
                 <w:szCs w:val="19"/>
               </w:rPr>
-              <w:t xml:space="preserve">51</w:t>
+              <w:t xml:space="preserve">54</w:t>
             </w:r>
           </w:p>
         </w:tc>
@@ -4131,7 +4131,7 @@
                 <w:sz w:val="19"/>
                 <w:szCs w:val="19"/>
               </w:rPr>
-              <w:t xml:space="preserve">485</w:t>
+              <w:t xml:space="preserve">496</w:t>
             </w:r>
           </w:p>
         </w:tc>
@@ -4155,7 +4155,7 @@
                 <w:sz w:val="19"/>
                 <w:szCs w:val="19"/>
               </w:rPr>
-              <w:t xml:space="preserve">77%</w:t>
+              <w:t xml:space="preserve">78%</w:t>
             </w:r>
           </w:p>
         </w:tc>
@@ -4490,7 +4490,7 @@
                 <w:sz w:val="19"/>
                 <w:szCs w:val="19"/>
               </w:rPr>
-              <w:t xml:space="preserve">69</w:t>
+              <w:t xml:space="preserve">72</w:t>
             </w:r>
           </w:p>
         </w:tc>
@@ -4515,7 +4515,7 @@
                 <w:sz w:val="19"/>
                 <w:szCs w:val="19"/>
               </w:rPr>
-              <w:t xml:space="preserve">626</w:t>
+              <w:t xml:space="preserve">637</w:t>
             </w:r>
           </w:p>
         </w:tc>
@@ -5099,7 +5099,7 @@
                 <w:sz w:val="19"/>
                 <w:szCs w:val="19"/>
               </w:rPr>
-              <w:t xml:space="preserve">6</w:t>
+              <w:t xml:space="preserve">7</w:t>
             </w:r>
           </w:p>
         </w:tc>
@@ -5124,7 +5124,7 @@
                 <w:sz w:val="19"/>
                 <w:szCs w:val="19"/>
               </w:rPr>
-              <w:t xml:space="preserve">63</w:t>
+              <w:t xml:space="preserve">66</w:t>
             </w:r>
           </w:p>
         </w:tc>
@@ -5734,7 +5734,7 @@
                 <w:sz w:val="19"/>
                 <w:szCs w:val="19"/>
               </w:rPr>
-              <w:t xml:space="preserve">3</w:t>
+              <w:t xml:space="preserve">4</w:t>
             </w:r>
           </w:p>
         </w:tc>
@@ -5759,7 +5759,7 @@
                 <w:sz w:val="19"/>
                 <w:szCs w:val="19"/>
               </w:rPr>
-              <w:t xml:space="preserve">34</w:t>
+              <w:t xml:space="preserve">37</w:t>
             </w:r>
           </w:p>
         </w:tc>
@@ -7512,7 +7512,7 @@
                 <w:sz w:val="19"/>
                 <w:szCs w:val="19"/>
               </w:rPr>
-              <w:t xml:space="preserve">1</w:t>
+              <w:t xml:space="preserve">2</w:t>
             </w:r>
           </w:p>
         </w:tc>
@@ -7537,7 +7537,7 @@
                 <w:sz w:val="19"/>
                 <w:szCs w:val="19"/>
               </w:rPr>
-              <w:t xml:space="preserve">13</w:t>
+              <w:t xml:space="preserve">18</w:t>
             </w:r>
           </w:p>
         </w:tc>
@@ -8332,7 +8332,7 @@
                 <w:sz w:val="19"/>
                 <w:szCs w:val="19"/>
               </w:rPr>
-              <w:t xml:space="preserve">28 histórias · 207 pontos</w:t>
+              <w:t xml:space="preserve">31 histórias · 218 pontos</w:t>
             </w:r>
           </w:p>
         </w:tc>
@@ -11176,6 +11176,131 @@
                 <w:szCs w:val="19"/>
               </w:rPr>
               <w:t xml:space="preserve">Aguarda amostras (ver 4.7)</w:t>
+            </w:r>
+          </w:p>
+        </w:tc>
+      </w:tr>
+      <w:tr>
+        <w:trPr>
+          <w:cantSplit/>
+        </w:trPr>
+        <w:tc>
+          <w:tcPr>
+            <w:tcW w:type="dxa" w:w="600"/>
+            <w:tcMar>
+              <w:top w:type="dxa" w:w="80"/>
+              <w:left w:type="dxa" w:w="110"/>
+              <w:bottom w:type="dxa" w:w="80"/>
+              <w:right w:type="dxa" w:w="110"/>
+            </w:tcMar>
+          </w:tcPr>
+          <w:p>
+            <w:pPr>
+              <w:spacing w:after="40" w:before="40" w:line="280"/>
+            </w:pPr>
+            <w:r>
+              <w:rPr>
+                <w:color w:val="2B2725"/>
+                <w:sz w:val="19"/>
+                <w:szCs w:val="19"/>
+              </w:rPr>
+              <w:t xml:space="preserve">D22</w:t>
+            </w:r>
+          </w:p>
+        </w:tc>
+        <w:tc>
+          <w:tcPr>
+            <w:tcW w:type="dxa" w:w="1900"/>
+            <w:tcMar>
+              <w:top w:type="dxa" w:w="80"/>
+              <w:left w:type="dxa" w:w="110"/>
+              <w:bottom w:type="dxa" w:w="80"/>
+              <w:right w:type="dxa" w:w="110"/>
+            </w:tcMar>
+          </w:tcPr>
+          <w:p>
+            <w:pPr>
+              <w:spacing w:after="40" w:before="40" w:line="280"/>
+            </w:pPr>
+            <w:r>
+              <w:rPr>
+                <w:color w:val="2B2725"/>
+                <w:sz w:val="19"/>
+                <w:szCs w:val="19"/>
+              </w:rPr>
+              <w:t xml:space="preserve">Maicon e Gabi (28/09)</w:t>
+            </w:r>
+          </w:p>
+        </w:tc>
+        <w:tc>
+          <w:tcPr>
+            <w:tcW w:type="dxa" w:w="3438"/>
+            <w:tcMar>
+              <w:top w:type="dxa" w:w="80"/>
+              <w:left w:type="dxa" w:w="110"/>
+              <w:bottom w:type="dxa" w:w="80"/>
+              <w:right w:type="dxa" w:w="110"/>
+            </w:tcMar>
+          </w:tcPr>
+          <w:p>
+            <w:pPr>
+              <w:spacing w:after="40" w:before="40" w:line="280"/>
+            </w:pPr>
+            <w:r>
+              <w:rPr>
+                <w:color w:val="2B2725"/>
+                <w:sz w:val="19"/>
+                <w:szCs w:val="19"/>
+              </w:rPr>
+              <w:t xml:space="preserve">Depois de importar as planilhas: acertar o mínimo de quarenta peças à mão; a importação reabria preenchida; a coluna Pronto com 690 peças virava rolagem sem fim</w:t>
+            </w:r>
+          </w:p>
+        </w:tc>
+        <w:tc>
+          <w:tcPr>
+            <w:tcW w:type="dxa" w:w="2200"/>
+            <w:tcMar>
+              <w:top w:type="dxa" w:w="80"/>
+              <w:left w:type="dxa" w:w="110"/>
+              <w:bottom w:type="dxa" w:w="80"/>
+              <w:right w:type="dxa" w:w="110"/>
+            </w:tcMar>
+          </w:tcPr>
+          <w:p>
+            <w:pPr>
+              <w:spacing w:after="40" w:before="40" w:line="280"/>
+            </w:pPr>
+            <w:r>
+              <w:rPr>
+                <w:color w:val="2B2725"/>
+                <w:sz w:val="19"/>
+                <w:szCs w:val="19"/>
+              </w:rPr>
+              <w:t xml:space="preserve">US-70, US-71, US-72</w:t>
+            </w:r>
+          </w:p>
+        </w:tc>
+        <w:tc>
+          <w:tcPr>
+            <w:tcW w:type="dxa" w:w="1500"/>
+            <w:tcMar>
+              <w:top w:type="dxa" w:w="80"/>
+              <w:left w:type="dxa" w:w="110"/>
+              <w:bottom w:type="dxa" w:w="80"/>
+              <w:right w:type="dxa" w:w="110"/>
+            </w:tcMar>
+          </w:tcPr>
+          <w:p>
+            <w:pPr>
+              <w:spacing w:after="40" w:before="40" w:line="280"/>
+            </w:pPr>
+            <w:r>
+              <w:rPr>
+                <w:color w:val="2B2725"/>
+                <w:sz w:val="19"/>
+                <w:szCs w:val="19"/>
+              </w:rPr>
+              <w:t xml:space="preserve">Atendida (28/09)</w:t>
             </w:r>
           </w:p>
         </w:tc>
@@ -11364,7 +11489,7 @@
           <w:sz w:val="23"/>
           <w:szCs w:val="23"/>
         </w:rPr>
-        <w:t xml:space="preserve">24 de setembro de 2026</w:t>
+        <w:t xml:space="preserve">24 e 28 de setembro de 2026</w:t>
       </w:r>
     </w:p>
     <w:p>
@@ -11450,6 +11575,24 @@
           <w:szCs w:val="22"/>
         </w:rPr>
         <w:t xml:space="preserve">Vinte histórias novas (US-50 a US-69). Quinze já estão em produção; as outras cinco estão nas sprints 7 e 8.</w:t>
+      </w:r>
+    </w:p>
+    <w:p>
+      <w:pPr>
+        <w:pStyle w:val="ListParagraph"/>
+        <w:numPr>
+          <w:ilvl w:val="0"/>
+          <w:numId w:val="2"/>
+        </w:numPr>
+        <w:spacing w:after="90" w:line="290"/>
+      </w:pPr>
+      <w:r>
+        <w:rPr>
+          <w:color w:val="2B2725"/>
+          <w:sz w:val="22"/>
+          <w:szCs w:val="22"/>
+        </w:rPr>
+        <w:t xml:space="preserve">28/09, dia da apresentação: ao importar as planilhas de vendas da Gabi (133 itens, 5.618 peças de junho a agosto) apareceram três pedidos pequenos, entregues no mesmo dia (US-70 a US-72): o botão que aplica os alvos ao cadastro, a importação que fecha limpa e a coluna do quadro com cinco lotes e "mostrar mais".</w:t>
       </w:r>
     </w:p>
     <w:p>
@@ -13872,7 +14015,7 @@
           <w:sz w:val="23"/>
           <w:szCs w:val="23"/>
         </w:rPr>
-        <w:t xml:space="preserve">E03 · Produção em quadro e livro-razão  ·  Concluído  ·  63 pontos</w:t>
+        <w:t xml:space="preserve">E03 · Produção em quadro e livro-razão  ·  Concluído  ·  66 pontos</w:t>
       </w:r>
     </w:p>
     <w:p>
@@ -15224,6 +15367,203 @@
                 <w:szCs w:val="19"/>
               </w:rPr>
               <w:t xml:space="preserve">US-12</w:t>
+            </w:r>
+          </w:p>
+        </w:tc>
+      </w:tr>
+      <w:tr>
+        <w:trPr>
+          <w:cantSplit/>
+        </w:trPr>
+        <w:tc>
+          <w:tcPr>
+            <w:tcW w:type="dxa" w:w="900"/>
+            <w:tcMar>
+              <w:top w:type="dxa" w:w="80"/>
+              <w:left w:type="dxa" w:w="110"/>
+              <w:bottom w:type="dxa" w:w="80"/>
+              <w:right w:type="dxa" w:w="110"/>
+            </w:tcMar>
+          </w:tcPr>
+          <w:p>
+            <w:pPr>
+              <w:spacing w:after="40" w:before="40" w:line="280"/>
+            </w:pPr>
+            <w:r>
+              <w:rPr>
+                <w:color w:val="2B2725"/>
+                <w:sz w:val="19"/>
+                <w:szCs w:val="19"/>
+              </w:rPr>
+              <w:t xml:space="preserve">US-72</w:t>
+            </w:r>
+          </w:p>
+        </w:tc>
+        <w:tc>
+          <w:tcPr>
+            <w:tcW w:type="dxa" w:w="5300"/>
+            <w:tcMar>
+              <w:top w:type="dxa" w:w="80"/>
+              <w:left w:type="dxa" w:w="110"/>
+              <w:bottom w:type="dxa" w:w="80"/>
+              <w:right w:type="dxa" w:w="110"/>
+            </w:tcMar>
+          </w:tcPr>
+          <w:p>
+            <w:pPr>
+              <w:spacing w:after="90" w:before="40" w:line="280"/>
+            </w:pPr>
+            <w:r>
+              <w:rPr>
+                <w:b/>
+                <w:bCs/>
+                <w:color w:val="2B2725"/>
+                <w:sz w:val="19"/>
+                <w:szCs w:val="19"/>
+              </w:rPr>
+              <w:t xml:space="preserve">Como equipe de produção, quero a coluna do quadro mostrando cinco lotes e um botão para abrir o resto, para "Pronto" com 690 peças não virar uma rolagem sem fim.</w:t>
+            </w:r>
+          </w:p>
+          <w:p>
+            <w:pPr>
+              <w:pStyle w:val="ListParagraph"/>
+              <w:numPr>
+                <w:ilvl w:val="0"/>
+                <w:numId w:val="3"/>
+              </w:numPr>
+              <w:spacing w:after="50" w:line="270"/>
+            </w:pPr>
+            <w:r>
+              <w:rPr>
+                <w:color w:val="4A4340"/>
+                <w:sz w:val="18"/>
+                <w:szCs w:val="18"/>
+              </w:rPr>
+              <w:t xml:space="preserve">Dada uma coluna com mais de cinco lotes, quando eu abrir o quadro, então vejo cinco e um botão dizendo quantos faltam; ao abrir, a coluna fica inteira até a página recarregar.</w:t>
+            </w:r>
+          </w:p>
+          <w:p>
+            <w:pPr>
+              <w:pStyle w:val="ListParagraph"/>
+              <w:numPr>
+                <w:ilvl w:val="0"/>
+                <w:numId w:val="3"/>
+              </w:numPr>
+              <w:spacing w:after="50" w:line="270"/>
+            </w:pPr>
+            <w:r>
+              <w:rPr>
+                <w:color w:val="4A4340"/>
+                <w:sz w:val="18"/>
+                <w:szCs w:val="18"/>
+              </w:rPr>
+              <w:t xml:space="preserve">Dado o modo de ordem de produção, quando ele estiver ligado, então a coluna abre inteira, porque ali se escolhe lotes.</w:t>
+            </w:r>
+          </w:p>
+          <w:p>
+            <w:pPr>
+              <w:pStyle w:val="ListParagraph"/>
+              <w:numPr>
+                <w:ilvl w:val="0"/>
+                <w:numId w:val="3"/>
+              </w:numPr>
+              <w:spacing w:after="50" w:line="270"/>
+            </w:pPr>
+            <w:r>
+              <w:rPr>
+                <w:color w:val="4A4340"/>
+                <w:sz w:val="18"/>
+                <w:szCs w:val="18"/>
+              </w:rPr>
+              <w:t xml:space="preserve">Dada uma página comprida, quando eu rolar até o fim, então o menu lateral acompanha em vez de ficar preso no topo.</w:t>
+            </w:r>
+          </w:p>
+          <w:p>
+            <w:pPr>
+              <w:spacing w:after="40" w:before="60"/>
+            </w:pPr>
+            <w:r>
+              <w:rPr>
+                <w:i/>
+                <w:iCs/>
+                <w:color w:val="6E6663"/>
+                <w:sz w:val="17"/>
+                <w:szCs w:val="17"/>
+              </w:rPr>
+              <w:t xml:space="preserve">Situação: Concluído</w:t>
+            </w:r>
+          </w:p>
+        </w:tc>
+        <w:tc>
+          <w:tcPr>
+            <w:tcW w:type="dxa" w:w="1000"/>
+            <w:tcMar>
+              <w:top w:type="dxa" w:w="80"/>
+              <w:left w:type="dxa" w:w="110"/>
+              <w:bottom w:type="dxa" w:w="80"/>
+              <w:right w:type="dxa" w:w="110"/>
+            </w:tcMar>
+          </w:tcPr>
+          <w:p>
+            <w:pPr>
+              <w:spacing w:after="40" w:before="40" w:line="280"/>
+            </w:pPr>
+            <w:r>
+              <w:rPr>
+                <w:color w:val="2B2725"/>
+                <w:sz w:val="19"/>
+                <w:szCs w:val="19"/>
+              </w:rPr>
+              <w:t xml:space="preserve">Should</w:t>
+            </w:r>
+          </w:p>
+        </w:tc>
+        <w:tc>
+          <w:tcPr>
+            <w:tcW w:type="dxa" w:w="700"/>
+            <w:tcMar>
+              <w:top w:type="dxa" w:w="80"/>
+              <w:left w:type="dxa" w:w="110"/>
+              <w:bottom w:type="dxa" w:w="80"/>
+              <w:right w:type="dxa" w:w="110"/>
+            </w:tcMar>
+          </w:tcPr>
+          <w:p>
+            <w:pPr>
+              <w:spacing w:after="40" w:before="40" w:line="280"/>
+              <w:jc w:val="center"/>
+            </w:pPr>
+            <w:r>
+              <w:rPr>
+                <w:color w:val="2B2725"/>
+                <w:sz w:val="19"/>
+                <w:szCs w:val="19"/>
+              </w:rPr>
+              <w:t xml:space="preserve">3</w:t>
+            </w:r>
+          </w:p>
+        </w:tc>
+        <w:tc>
+          <w:tcPr>
+            <w:tcW w:type="dxa" w:w="1738"/>
+            <w:tcMar>
+              <w:top w:type="dxa" w:w="80"/>
+              <w:left w:type="dxa" w:w="110"/>
+              <w:bottom w:type="dxa" w:w="80"/>
+              <w:right w:type="dxa" w:w="110"/>
+            </w:tcMar>
+          </w:tcPr>
+          <w:p>
+            <w:pPr>
+              <w:spacing w:after="40" w:before="40" w:line="280"/>
+            </w:pPr>
+            <w:r>
+              <w:rPr>
+                <w:color w:val="2B2725"/>
+                <w:sz w:val="19"/>
+                <w:szCs w:val="19"/>
+              </w:rPr>
+              <w:t xml:space="preserve">US-11</w:t>
             </w:r>
           </w:p>
         </w:tc>
@@ -18253,7 +18593,7 @@
           <w:sz w:val="23"/>
           <w:szCs w:val="23"/>
         </w:rPr>
-        <w:t xml:space="preserve">E08 · Vendas, cobertura e preços  ·  Concluído  ·  34 pontos</w:t>
+        <w:t xml:space="preserve">E08 · Vendas, cobertura e preços  ·  Concluído  ·  37 pontos</w:t>
       </w:r>
     </w:p>
     <w:p>
@@ -19017,6 +19357,185 @@
                 <w:szCs w:val="19"/>
               </w:rPr>
               <w:t xml:space="preserve">US-13</w:t>
+            </w:r>
+          </w:p>
+        </w:tc>
+      </w:tr>
+      <w:tr>
+        <w:trPr>
+          <w:cantSplit/>
+        </w:trPr>
+        <w:tc>
+          <w:tcPr>
+            <w:tcW w:type="dxa" w:w="900"/>
+            <w:tcMar>
+              <w:top w:type="dxa" w:w="80"/>
+              <w:left w:type="dxa" w:w="110"/>
+              <w:bottom w:type="dxa" w:w="80"/>
+              <w:right w:type="dxa" w:w="110"/>
+            </w:tcMar>
+          </w:tcPr>
+          <w:p>
+            <w:pPr>
+              <w:spacing w:after="40" w:before="40" w:line="280"/>
+            </w:pPr>
+            <w:r>
+              <w:rPr>
+                <w:color w:val="2B2725"/>
+                <w:sz w:val="19"/>
+                <w:szCs w:val="19"/>
+              </w:rPr>
+              <w:t xml:space="preserve">US-71</w:t>
+            </w:r>
+          </w:p>
+        </w:tc>
+        <w:tc>
+          <w:tcPr>
+            <w:tcW w:type="dxa" w:w="5300"/>
+            <w:tcMar>
+              <w:top w:type="dxa" w:w="80"/>
+              <w:left w:type="dxa" w:w="110"/>
+              <w:bottom w:type="dxa" w:w="80"/>
+              <w:right w:type="dxa" w:w="110"/>
+            </w:tcMar>
+          </w:tcPr>
+          <w:p>
+            <w:pPr>
+              <w:spacing w:after="90" w:before="40" w:line="280"/>
+            </w:pPr>
+            <w:r>
+              <w:rPr>
+                <w:b/>
+                <w:bCs/>
+                <w:color w:val="2B2725"/>
+                <w:sz w:val="19"/>
+                <w:szCs w:val="19"/>
+              </w:rPr>
+              <w:t xml:space="preserve">Como auxiliar administrativa, quero que a importação feche limpa e reimportar só mostre o que faltou, para não importar a mesma planilha duas vezes sem querer.</w:t>
+            </w:r>
+          </w:p>
+          <w:p>
+            <w:pPr>
+              <w:pStyle w:val="ListParagraph"/>
+              <w:numPr>
+                <w:ilvl w:val="0"/>
+                <w:numId w:val="3"/>
+              </w:numPr>
+              <w:spacing w:after="50" w:line="270"/>
+            </w:pPr>
+            <w:r>
+              <w:rPr>
+                <w:color w:val="4A4340"/>
+                <w:sz w:val="18"/>
+                <w:szCs w:val="18"/>
+              </w:rPr>
+              <w:t xml:space="preserve">Dada a importação fechada ou cancelada, quando eu reabrir, então conteúdo, canal, arquivo e resultado estão vazios.</w:t>
+            </w:r>
+          </w:p>
+          <w:p>
+            <w:pPr>
+              <w:pStyle w:val="ListParagraph"/>
+              <w:numPr>
+                <w:ilvl w:val="0"/>
+                <w:numId w:val="3"/>
+              </w:numPr>
+              <w:spacing w:after="50" w:line="270"/>
+            </w:pPr>
+            <w:r>
+              <w:rPr>
+                <w:color w:val="4A4340"/>
+                <w:sz w:val="18"/>
+                <w:szCs w:val="18"/>
+              </w:rPr>
+              <w:t xml:space="preserve">Dada a mesma planilha importada de novo no mesmo canal, quando ela entrar, então o que já existia conta como atualizado sem baixar de novo, e só o que não casou fica na lista de não reconhecidas.</w:t>
+            </w:r>
+          </w:p>
+          <w:p>
+            <w:pPr>
+              <w:spacing w:after="40" w:before="60"/>
+            </w:pPr>
+            <w:r>
+              <w:rPr>
+                <w:i/>
+                <w:iCs/>
+                <w:color w:val="6E6663"/>
+                <w:sz w:val="17"/>
+                <w:szCs w:val="17"/>
+              </w:rPr>
+              <w:t xml:space="preserve">Situação: Concluído</w:t>
+            </w:r>
+          </w:p>
+        </w:tc>
+        <w:tc>
+          <w:tcPr>
+            <w:tcW w:type="dxa" w:w="1000"/>
+            <w:tcMar>
+              <w:top w:type="dxa" w:w="80"/>
+              <w:left w:type="dxa" w:w="110"/>
+              <w:bottom w:type="dxa" w:w="80"/>
+              <w:right w:type="dxa" w:w="110"/>
+            </w:tcMar>
+          </w:tcPr>
+          <w:p>
+            <w:pPr>
+              <w:spacing w:after="40" w:before="40" w:line="280"/>
+            </w:pPr>
+            <w:r>
+              <w:rPr>
+                <w:color w:val="2B2725"/>
+                <w:sz w:val="19"/>
+                <w:szCs w:val="19"/>
+              </w:rPr>
+              <w:t xml:space="preserve">Should</w:t>
+            </w:r>
+          </w:p>
+        </w:tc>
+        <w:tc>
+          <w:tcPr>
+            <w:tcW w:type="dxa" w:w="700"/>
+            <w:tcMar>
+              <w:top w:type="dxa" w:w="80"/>
+              <w:left w:type="dxa" w:w="110"/>
+              <w:bottom w:type="dxa" w:w="80"/>
+              <w:right w:type="dxa" w:w="110"/>
+            </w:tcMar>
+          </w:tcPr>
+          <w:p>
+            <w:pPr>
+              <w:spacing w:after="40" w:before="40" w:line="280"/>
+              <w:jc w:val="center"/>
+            </w:pPr>
+            <w:r>
+              <w:rPr>
+                <w:color w:val="2B2725"/>
+                <w:sz w:val="19"/>
+                <w:szCs w:val="19"/>
+              </w:rPr>
+              <w:t xml:space="preserve">3</w:t>
+            </w:r>
+          </w:p>
+        </w:tc>
+        <w:tc>
+          <w:tcPr>
+            <w:tcW w:type="dxa" w:w="1738"/>
+            <w:tcMar>
+              <w:top w:type="dxa" w:w="80"/>
+              <w:left w:type="dxa" w:w="110"/>
+              <w:bottom w:type="dxa" w:w="80"/>
+              <w:right w:type="dxa" w:w="110"/>
+            </w:tcMar>
+          </w:tcPr>
+          <w:p>
+            <w:pPr>
+              <w:spacing w:after="40" w:before="40" w:line="280"/>
+            </w:pPr>
+            <w:r>
+              <w:rPr>
+                <w:color w:val="2B2725"/>
+                <w:sz w:val="19"/>
+                <w:szCs w:val="19"/>
+              </w:rPr>
+              <w:t xml:space="preserve">US-27</w:t>
             </w:r>
           </w:p>
         </w:tc>
@@ -27542,7 +28061,7 @@
           <w:sz w:val="23"/>
           <w:szCs w:val="23"/>
         </w:rPr>
-        <w:t xml:space="preserve">E22 · Alvo de estoque pela venda  ·  Concluído  ·  13 pontos</w:t>
+        <w:t xml:space="preserve">E22 · Alvo de estoque pela venda  ·  Concluído  ·  18 pontos</w:t>
       </w:r>
     </w:p>
     <w:p>
@@ -27930,6 +28449,218 @@
                 <w:szCs w:val="19"/>
               </w:rPr>
               <w:t xml:space="preserve">US-22, US-27</w:t>
+            </w:r>
+          </w:p>
+        </w:tc>
+      </w:tr>
+      <w:tr>
+        <w:trPr>
+          <w:cantSplit/>
+        </w:trPr>
+        <w:tc>
+          <w:tcPr>
+            <w:tcW w:type="dxa" w:w="900"/>
+            <w:tcMar>
+              <w:top w:type="dxa" w:w="80"/>
+              <w:left w:type="dxa" w:w="110"/>
+              <w:bottom w:type="dxa" w:w="80"/>
+              <w:right w:type="dxa" w:w="110"/>
+            </w:tcMar>
+          </w:tcPr>
+          <w:p>
+            <w:pPr>
+              <w:spacing w:after="40" w:before="40" w:line="280"/>
+            </w:pPr>
+            <w:r>
+              <w:rPr>
+                <w:color w:val="2B2725"/>
+                <w:sz w:val="19"/>
+                <w:szCs w:val="19"/>
+              </w:rPr>
+              <w:t xml:space="preserve">US-70</w:t>
+            </w:r>
+          </w:p>
+        </w:tc>
+        <w:tc>
+          <w:tcPr>
+            <w:tcW w:type="dxa" w:w="5300"/>
+            <w:tcMar>
+              <w:top w:type="dxa" w:w="80"/>
+              <w:left w:type="dxa" w:w="110"/>
+              <w:bottom w:type="dxa" w:w="80"/>
+              <w:right w:type="dxa" w:w="110"/>
+            </w:tcMar>
+          </w:tcPr>
+          <w:p>
+            <w:pPr>
+              <w:spacing w:after="90" w:before="40" w:line="280"/>
+            </w:pPr>
+            <w:r>
+              <w:rPr>
+                <w:b/>
+                <w:bCs/>
+                <w:color w:val="2B2725"/>
+                <w:sz w:val="19"/>
+                <w:szCs w:val="19"/>
+              </w:rPr>
+              <w:t xml:space="preserve">Como dona do ateliê, quero um botão que grave no cadastro o alvo que a venda dá hoje, para não abrir quarenta peças à mão depois de importar as planilhas.</w:t>
+            </w:r>
+          </w:p>
+          <w:p>
+            <w:pPr>
+              <w:pStyle w:val="ListParagraph"/>
+              <w:numPr>
+                <w:ilvl w:val="0"/>
+                <w:numId w:val="3"/>
+              </w:numPr>
+              <w:spacing w:after="50" w:line="270"/>
+            </w:pPr>
+            <w:r>
+              <w:rPr>
+                <w:color w:val="4A4340"/>
+                <w:sz w:val="18"/>
+                <w:szCs w:val="18"/>
+              </w:rPr>
+              <w:t xml:space="preserve">Dada uma peça (e cada cor dela) com venda em mês fechado, quando eu aplicar, então o mínimo desejado passa a ser o alvo pela venda, e a tela diz quantas peças e cores mudaram.</w:t>
+            </w:r>
+          </w:p>
+          <w:p>
+            <w:pPr>
+              <w:pStyle w:val="ListParagraph"/>
+              <w:numPr>
+                <w:ilvl w:val="0"/>
+                <w:numId w:val="3"/>
+              </w:numPr>
+              <w:spacing w:after="50" w:line="270"/>
+            </w:pPr>
+            <w:r>
+              <w:rPr>
+                <w:color w:val="4A4340"/>
+                <w:sz w:val="18"/>
+                <w:szCs w:val="18"/>
+              </w:rPr>
+              <w:t xml:space="preserve">Dada uma peça sem venda em mês fechado, quando eu aplicar, então ela fica como estava.</w:t>
+            </w:r>
+          </w:p>
+          <w:p>
+            <w:pPr>
+              <w:pStyle w:val="ListParagraph"/>
+              <w:numPr>
+                <w:ilvl w:val="0"/>
+                <w:numId w:val="3"/>
+              </w:numPr>
+              <w:spacing w:after="50" w:line="270"/>
+            </w:pPr>
+            <w:r>
+              <w:rPr>
+                <w:color w:val="4A4340"/>
+                <w:sz w:val="18"/>
+                <w:szCs w:val="18"/>
+              </w:rPr>
+              <w:t xml:space="preserve">Dado o botão apertado duas vezes, quando nada mudou, então nada é gravado de novo.</w:t>
+            </w:r>
+          </w:p>
+          <w:p>
+            <w:pPr>
+              <w:spacing w:after="40" w:before="60"/>
+            </w:pPr>
+            <w:r>
+              <w:rPr>
+                <w:i/>
+                <w:iCs/>
+                <w:color w:val="6E6663"/>
+                <w:sz w:val="17"/>
+                <w:szCs w:val="17"/>
+              </w:rPr>
+              <w:t xml:space="preserve">Situação: Concluído</w:t>
+            </w:r>
+          </w:p>
+          <w:p>
+            <w:pPr>
+              <w:spacing w:after="40" w:before="20"/>
+            </w:pPr>
+            <w:r>
+              <w:rPr>
+                <w:i/>
+                <w:iCs/>
+                <w:color w:val="8A5A2B"/>
+                <w:sz w:val="17"/>
+                <w:szCs w:val="17"/>
+              </w:rPr>
+              <w:t xml:space="preserve">Nota: Pedido do Maicon em 28/09, ao importar as vendas de junho a agosto da Gabi (133 itens, 5.618 peças) e ver "manter 2, cadastro diz 10" em dezenas de peças.</w:t>
+            </w:r>
+          </w:p>
+        </w:tc>
+        <w:tc>
+          <w:tcPr>
+            <w:tcW w:type="dxa" w:w="1000"/>
+            <w:tcMar>
+              <w:top w:type="dxa" w:w="80"/>
+              <w:left w:type="dxa" w:w="110"/>
+              <w:bottom w:type="dxa" w:w="80"/>
+              <w:right w:type="dxa" w:w="110"/>
+            </w:tcMar>
+          </w:tcPr>
+          <w:p>
+            <w:pPr>
+              <w:spacing w:after="40" w:before="40" w:line="280"/>
+            </w:pPr>
+            <w:r>
+              <w:rPr>
+                <w:color w:val="2B2725"/>
+                <w:sz w:val="19"/>
+                <w:szCs w:val="19"/>
+              </w:rPr>
+              <w:t xml:space="preserve">Should</w:t>
+            </w:r>
+          </w:p>
+        </w:tc>
+        <w:tc>
+          <w:tcPr>
+            <w:tcW w:type="dxa" w:w="700"/>
+            <w:tcMar>
+              <w:top w:type="dxa" w:w="80"/>
+              <w:left w:type="dxa" w:w="110"/>
+              <w:bottom w:type="dxa" w:w="80"/>
+              <w:right w:type="dxa" w:w="110"/>
+            </w:tcMar>
+          </w:tcPr>
+          <w:p>
+            <w:pPr>
+              <w:spacing w:after="40" w:before="40" w:line="280"/>
+              <w:jc w:val="center"/>
+            </w:pPr>
+            <w:r>
+              <w:rPr>
+                <w:color w:val="2B2725"/>
+                <w:sz w:val="19"/>
+                <w:szCs w:val="19"/>
+              </w:rPr>
+              <w:t xml:space="preserve">5</w:t>
+            </w:r>
+          </w:p>
+        </w:tc>
+        <w:tc>
+          <w:tcPr>
+            <w:tcW w:type="dxa" w:w="1738"/>
+            <w:tcMar>
+              <w:top w:type="dxa" w:w="80"/>
+              <w:left w:type="dxa" w:w="110"/>
+              <w:bottom w:type="dxa" w:w="80"/>
+              <w:right w:type="dxa" w:w="110"/>
+            </w:tcMar>
+          </w:tcPr>
+          <w:p>
+            <w:pPr>
+              <w:spacing w:after="40" w:before="40" w:line="280"/>
+            </w:pPr>
+            <w:r>
+              <w:rPr>
+                <w:color w:val="2B2725"/>
+                <w:sz w:val="19"/>
+                <w:szCs w:val="19"/>
+              </w:rPr>
+              <w:t xml:space="preserve">US-53</w:t>
             </w:r>
           </w:p>
         </w:tc>
@@ -31794,7 +32525,7 @@
                 <w:sz w:val="19"/>
                 <w:szCs w:val="19"/>
               </w:rPr>
-              <w:t xml:space="preserve">US-56, US-57, US-36, US-37, US-69</w:t>
+              <w:t xml:space="preserve">US-70, US-71, US-72 (já entregues em 28/09), US-56, US-57, US-36, US-37, US-69</w:t>
             </w:r>
           </w:p>
         </w:tc>

</xml_diff>